<commit_message>
docs: finalize formal academic workshop module in PDF, DOCX, HTML, and MD formats
</commit_message>
<xml_diff>
--- a/docs/MODUL_PANDUAN_WORKSHOP_WEBGIS.docx
+++ b/docs/MODUL_PANDUAN_WORKSHOP_WEBGIS.docx
@@ -7,10 +7,20 @@
         <w:rPr>
           <w:rFonts w:ascii="Arial" w:hAnsi="Arial"/>
           <w:b/>
+          <w:color w:val="64748B"/>
+          <w:sz w:val="18"/>
+        </w:rPr>
+        <w:t>MODUL PEMBELAJARAN &amp; PEDOMAN PRAKTIKUM LABORATORIUM GIS</w:t>
+        <w:br/>
+      </w:r>
+      <w:r>
+        <w:rPr>
+          <w:rFonts w:ascii="Arial" w:hAnsi="Arial"/>
+          <w:b/>
           <w:color w:val="D97706"/>
           <w:sz w:val="20"/>
         </w:rPr>
-        <w:t>MODUL PRAKTIKUM &amp; PANDUAN WORKSHOP INTENSIF (2 JAM)</w:t>
+        <w:t>EDISI LENGKAP WORKSHOP INTENSIF (120 MENIT)</w:t>
         <w:br/>
       </w:r>
       <w:r>
@@ -18,9 +28,9 @@
           <w:rFonts w:ascii="Arial" w:hAnsi="Arial"/>
           <w:b/>
           <w:color w:val="0F4C3A"/>
-          <w:sz w:val="44"/>
+          <w:sz w:val="40"/>
         </w:rPr>
-        <w:t>Pemanfaatan Ekosistem Multi-AI dalam Pembuatan WebGIS Sebaran Tematik</w:t>
+        <w:t>Pengembangan Sistem Informasi Geografis Berbasis Web (WebGIS) Tematik Menggunakan Ekosistem Artificial Intelligence</w:t>
       </w:r>
     </w:p>
     <w:p>
@@ -29,9 +39,9 @@
           <w:rFonts w:ascii="Arial" w:hAnsi="Arial"/>
           <w:i/>
           <w:color w:val="475569"/>
-          <w:sz w:val="24"/>
+          <w:sz w:val="22"/>
         </w:rPr>
-        <w:t>Alur Kerja Komprehensif: Scraping Data Spasial, Validasi Anti-Halusinasi, Prototyping UI, Agentic Coding Antigravity, hingga Hosting Gratis di GitHub Pages</w:t>
+        <w:t>Panduan Komprehensif: Ekstraksi Data Spasial Otomatis, Protokol Validasi Geodesi Anti-Halusinasi, Perancangan Antarmuka Responsif, Pemrograman Otonom, hingga Publikasi Terbuka di GitHub Pages.</w:t>
       </w:r>
     </w:p>
     <w:tbl>
@@ -73,7 +83,7 @@
           </w:tcPr>
           <w:p>
             <w:r>
-              <w:t>Studi Kasus: WebGIS Sejarah Islam Nusantara</w:t>
+              <w:t>Studi Kasus: Atlas Sejarah Islam Nusantara</w:t>
             </w:r>
           </w:p>
         </w:tc>
@@ -99,17 +109,53 @@
           <w:rFonts w:ascii="Arial" w:hAnsi="Arial"/>
           <w:b/>
           <w:color w:val="0F4C3A"/>
-          <w:sz w:val="30"/>
+          <w:sz w:val="28"/>
         </w:rPr>
-        <w:t>1. Latar Belakang &amp; Paradigma Baru Pengembangan GIS</w:t>
+        <w:t>Bagian I: Pendahuluan &amp; Landasan Teori</w:t>
       </w:r>
     </w:p>
     <w:p>
       <w:pPr>
-        <w:spacing w:line="300" w:lineRule="auto"/>
+        <w:pStyle w:val="Heading2"/>
       </w:pPr>
       <w:r>
-        <w:t>Pembuatan WebGIS tematik konvensional membutuhkan keterampilan multidisiplin: kartografi, format data spasial GeoJSON, HTML/CSS, Leaflet JS, dan server web. Kehadiran Generative AI dan Agentic AI Coding mengubah paradigma ini: pengembang kini bertindak sebagai Arsitek Sistem dan Kurator Kualitas Data, sementara AI mengotomasi penulisan kode dan perbaikan bug.</w:t>
+        <w:rPr>
+          <w:rFonts w:ascii="Arial" w:hAnsi="Arial"/>
+          <w:b/>
+          <w:color w:val="1A5D48"/>
+          <w:sz w:val="23"/>
+        </w:rPr>
+        <w:t>1.1 Transformasi Paradigma Geospasial di Era AI</w:t>
+      </w:r>
+    </w:p>
+    <w:p>
+      <w:pPr>
+        <w:spacing w:line="288" w:lineRule="auto"/>
+      </w:pPr>
+      <w:r>
+        <w:t>WebGIS adalah sarana utama dalam mendemokratisasikan akses data geospasial bagi masyarakat luas. Pengembangan WebGIS konvensional memerlukan kemahiran multidisiplin: kartografi geodesi, struktur data GeoJSON/WGS84, antarmuka web, pustaka pemetaan Leaflet, serta manajemen server. Hadirnya Generative AI dan Agentic AI Coding Assistant mentransformasi pengembang menjadi Arsitek Sistem dan Kurator Kualitas Data, sementara AI mengotomasi penulisan kode sintaksis dan debugging.</w:t>
+      </w:r>
+    </w:p>
+    <w:p>
+      <w:pPr>
+        <w:pStyle w:val="Heading2"/>
+      </w:pPr>
+      <w:r>
+        <w:rPr>
+          <w:rFonts w:ascii="Arial" w:hAnsi="Arial"/>
+          <w:b/>
+          <w:color w:val="1A5D48"/>
+          <w:sz w:val="23"/>
+        </w:rPr>
+        <w:t>1.2 Capaian Pembelajaran Workshop (Learning Outcomes)</w:t>
+      </w:r>
+    </w:p>
+    <w:p>
+      <w:pPr>
+        <w:spacing w:line="288" w:lineRule="auto"/>
+      </w:pPr>
+      <w:r>
+        <w:t>Peserta diharapkan menguasai: 1) Pemahaman arsitektur multi-AI, 2) Keterampilan teknis ekstraksi data web dan validasi koordinat WGS84, 3) Perancangan antarmuka mobile-first Leaflet, 4) Publikasi otonom via GitHub Pages, serta 5) Integritas data ilmiah.</w:t>
       </w:r>
     </w:p>
     <w:p>
@@ -121,259 +167,65 @@
           <w:rFonts w:ascii="Arial" w:hAnsi="Arial"/>
           <w:b/>
           <w:color w:val="0F4C3A"/>
-          <w:sz w:val="30"/>
+          <w:sz w:val="28"/>
         </w:rPr>
-        <w:t>2. Rundown Workshop Intensif 2 Jam (120 Menit)</w:t>
+        <w:t>Bagian II: Alokasi Waktu &amp; Silabus Pelatihan (120 Menit)</w:t>
       </w:r>
     </w:p>
     <w:p>
       <w:pPr>
-        <w:spacing w:line="300" w:lineRule="auto"/>
+        <w:spacing w:line="288" w:lineRule="auto"/>
       </w:pPr>
       <w:r>
-        <w:t>Jadwal disusun presisi untuk memastikan seluruh peserta dapat menyelesaikan proyek WebGIS dan mempublikasikannya:</w:t>
-      </w:r>
-    </w:p>
-    <w:tbl>
-      <w:tblPr>
-        <w:tblW w:type="auto" w:w="0"/>
-        <w:jc w:val="center"/>
-        <w:tblLook w:firstColumn="1" w:firstRow="1" w:lastColumn="0" w:lastRow="0" w:noHBand="0" w:noVBand="1" w:val="04A0"/>
-      </w:tblPr>
-      <w:tblGrid>
-        <w:gridCol w:w="3312"/>
-        <w:gridCol w:w="3312"/>
-        <w:gridCol w:w="3312"/>
-      </w:tblGrid>
-      <w:tr>
-        <w:tc>
-          <w:tcPr>
-            <w:tcW w:type="dxa" w:w="3312"/>
-            <w:shd w:fill="0F4C3A"/>
-          </w:tcPr>
-          <w:p>
-            <w:r>
-              <w:rPr>
-                <w:b/>
-                <w:color w:val="FFFFFF"/>
-              </w:rPr>
-              <w:t>Waktu &amp; Durasi</w:t>
-            </w:r>
-          </w:p>
-        </w:tc>
-        <w:tc>
-          <w:tcPr>
-            <w:tcW w:type="dxa" w:w="3312"/>
-            <w:shd w:fill="0F4C3A"/>
-          </w:tcPr>
-          <w:p>
-            <w:r>
-              <w:rPr>
-                <w:b/>
-                <w:color w:val="FFFFFF"/>
-              </w:rPr>
-              <w:t>Materi &amp; Aktivitas</w:t>
-            </w:r>
-          </w:p>
-        </w:tc>
-        <w:tc>
-          <w:tcPr>
-            <w:tcW w:type="dxa" w:w="3312"/>
-            <w:shd w:fill="0F4C3A"/>
-          </w:tcPr>
-          <w:p>
-            <w:r>
-              <w:rPr>
-                <w:b/>
-                <w:color w:val="FFFFFF"/>
-              </w:rPr>
-              <w:t>Output Peserta</w:t>
-            </w:r>
-          </w:p>
-        </w:tc>
-      </w:tr>
-      <w:tr>
-        <w:tc>
-          <w:tcPr>
-            <w:tcW w:type="dxa" w:w="3312"/>
-          </w:tcPr>
-          <w:p>
-            <w:r>
-              <w:t>00:00 - 00:15 (15 mnt)</w:t>
-            </w:r>
-          </w:p>
-        </w:tc>
-        <w:tc>
-          <w:tcPr>
-            <w:tcW w:type="dxa" w:w="3312"/>
-          </w:tcPr>
-          <w:p>
-            <w:r>
-              <w:t>Pengantar &amp; Paradigma 3 Pilar AI (ChatGPT, AI Studio, Antigravity)</w:t>
-            </w:r>
-          </w:p>
-        </w:tc>
-        <w:tc>
-          <w:tcPr>
-            <w:tcW w:type="dxa" w:w="3312"/>
-          </w:tcPr>
-          <w:p>
-            <w:r>
-              <w:t>Pemahaman alur kerja modern</w:t>
-            </w:r>
-          </w:p>
-        </w:tc>
-      </w:tr>
-      <w:tr>
-        <w:tc>
-          <w:tcPr>
-            <w:tcW w:type="dxa" w:w="3312"/>
-          </w:tcPr>
-          <w:p>
-            <w:r>
-              <w:t>00:15 - 00:40 (25 mnt)</w:t>
-            </w:r>
-          </w:p>
-        </w:tc>
-        <w:tc>
-          <w:tcPr>
-            <w:tcW w:type="dxa" w:w="3312"/>
-          </w:tcPr>
-          <w:p>
-            <w:r>
-              <w:t>Sesi 1: AI Web Scraping &amp; Ekstraksi Data Spasial dari Web</w:t>
-            </w:r>
-          </w:p>
-        </w:tc>
-        <w:tc>
-          <w:tcPr>
-            <w:tcW w:type="dxa" w:w="3312"/>
-          </w:tcPr>
-          <w:p>
-            <w:r>
-              <w:t>Dataset mentah terstruktur</w:t>
-            </w:r>
-          </w:p>
-        </w:tc>
-      </w:tr>
-      <w:tr>
-        <w:tc>
-          <w:tcPr>
-            <w:tcW w:type="dxa" w:w="3312"/>
-          </w:tcPr>
-          <w:p>
-            <w:r>
-              <w:t>00:40 - 01:00 (20 mnt)</w:t>
-            </w:r>
-          </w:p>
-        </w:tc>
-        <w:tc>
-          <w:tcPr>
-            <w:tcW w:type="dxa" w:w="3312"/>
-          </w:tcPr>
-          <w:p>
-            <w:r>
-              <w:t>Sesi 2: Validasi Koordinat, Anti-Halusinasi &amp; Dataset Mandiri</w:t>
-            </w:r>
-          </w:p>
-        </w:tc>
-        <w:tc>
-          <w:tcPr>
-            <w:tcW w:type="dxa" w:w="3312"/>
-          </w:tcPr>
-          <w:p>
-            <w:r>
-              <w:t>Dataset bersih &amp; terverifikasi</w:t>
-            </w:r>
-          </w:p>
-        </w:tc>
-      </w:tr>
-      <w:tr>
-        <w:tc>
-          <w:tcPr>
-            <w:tcW w:type="dxa" w:w="3312"/>
-          </w:tcPr>
-          <w:p>
-            <w:r>
-              <w:t>01:00 - 01:35 (35 mnt)</w:t>
-            </w:r>
-          </w:p>
-        </w:tc>
-        <w:tc>
-          <w:tcPr>
-            <w:tcW w:type="dxa" w:w="3312"/>
-          </w:tcPr>
-          <w:p>
-            <w:r>
-              <w:t>Sesi 3: Hands-on Coding di Antigravity (Leaflet WebGIS &amp; Mobile)</w:t>
-            </w:r>
-          </w:p>
-        </w:tc>
-        <w:tc>
-          <w:tcPr>
-            <w:tcW w:type="dxa" w:w="3312"/>
-          </w:tcPr>
-          <w:p>
-            <w:r>
-              <w:t>WebGIS aktif di server lokal</w:t>
-            </w:r>
-          </w:p>
-        </w:tc>
-      </w:tr>
-      <w:tr>
-        <w:tc>
-          <w:tcPr>
-            <w:tcW w:type="dxa" w:w="3312"/>
-          </w:tcPr>
-          <w:p>
-            <w:r>
-              <w:t>01:35 - 01:50 (15 mnt)</w:t>
-            </w:r>
-          </w:p>
-        </w:tc>
-        <w:tc>
-          <w:tcPr>
-            <w:tcW w:type="dxa" w:w="3312"/>
-          </w:tcPr>
-          <w:p>
-            <w:r>
-              <w:t>Sesi 4: Otomasi Publikasi &amp; Hosting Gratis di GitHub Pages</w:t>
-            </w:r>
-          </w:p>
-        </w:tc>
-        <w:tc>
-          <w:tcPr>
-            <w:tcW w:type="dxa" w:w="3312"/>
-          </w:tcPr>
-          <w:p>
-            <w:r>
-              <w:t>WebGIS online dapat diakses via HP</w:t>
-            </w:r>
-          </w:p>
-        </w:tc>
-      </w:tr>
-    </w:tbl>
-    <w:p/>
-    <w:p>
-      <w:pPr>
-        <w:pStyle w:val="Heading1"/>
-      </w:pPr>
-      <w:r>
-        <w:rPr>
-          <w:rFonts w:ascii="Arial" w:hAnsi="Arial"/>
-          <w:b/>
-          <w:color w:val="0F4C3A"/>
-          <w:sz w:val="30"/>
-        </w:rPr>
-        <w:t>3. Fase 1: AI Web Scraping &amp; Ekstraksi Data Spasial</w:t>
+        <w:t>Pelatihan dirancang intensif dalam 5 fase kerja terstruktur:</w:t>
       </w:r>
     </w:p>
     <w:p>
       <w:pPr>
-        <w:spacing w:line="300" w:lineRule="auto"/>
+        <w:spacing w:line="288" w:lineRule="auto"/>
       </w:pPr>
       <w:r>
-        <w:t>Peserta diajarkan teknik mengekstrak data dari artikel web/Wikipedia menggunakan metode prompt parsing ke JSON/GeoJSON WGS84, atau skrip Python ringan menggunakan BeautifulSoup.</w:t>
+        <w:t>1. 00:00 - 00:15 (15 mnt): Pengantar Paradigma 3 Pilar AI (ChatGPT, Google AI Studio, Antigravity)</w:t>
+      </w:r>
+    </w:p>
+    <w:p>
+      <w:pPr>
+        <w:spacing w:line="288" w:lineRule="auto"/>
+      </w:pPr>
+      <w:r>
+        <w:t>2. 00:15 - 00:40 (25 mnt): Fase 1 - AI Web Scraping &amp; Ekstraksi Data Tabular Web ke format JSON</w:t>
+      </w:r>
+    </w:p>
+    <w:p>
+      <w:pPr>
+        <w:spacing w:line="288" w:lineRule="auto"/>
+      </w:pPr>
+      <w:r>
+        <w:t>3. 00:40 - 01:00 (20 mnt): Fase 2 - Validasi Geospasial Anti-Halusinasi &amp; Penyusunan Dataset Mandiri</w:t>
+      </w:r>
+    </w:p>
+    <w:p>
+      <w:pPr>
+        <w:spacing w:line="288" w:lineRule="auto"/>
+      </w:pPr>
+      <w:r>
+        <w:t>4. 01:00 - 01:35 (35 mnt): Fase 3 - Hands-on Coding di Antigravity (Peta Leaflet, Drawer, &amp; Mobile)</w:t>
+      </w:r>
+    </w:p>
+    <w:p>
+      <w:pPr>
+        <w:spacing w:line="288" w:lineRule="auto"/>
+      </w:pPr>
+      <w:r>
+        <w:t>5. 01:35 - 01:50 (15 mnt): Fase 4 - Otomasi Publikasi Git &amp; Peluncuran GitHub Pages</w:t>
+      </w:r>
+    </w:p>
+    <w:p>
+      <w:pPr>
+        <w:spacing w:line="288" w:lineRule="auto"/>
+      </w:pPr>
+      <w:r>
+        <w:t>6. 01:50 - 02:00 (10 mnt): Fase 5 - Evaluasi Ujian &amp; Presentasi Karya Peserta</w:t>
       </w:r>
     </w:p>
     <w:p>
@@ -385,17 +237,17 @@
           <w:rFonts w:ascii="Arial" w:hAnsi="Arial"/>
           <w:b/>
           <w:color w:val="0F4C3A"/>
-          <w:sz w:val="30"/>
+          <w:sz w:val="28"/>
         </w:rPr>
-        <w:t>4. Fase 2: Koreksi &amp; Pemeriksaan Keakuratan Data (Anti-Hallucination)</w:t>
+        <w:t>Bagian III: Ekstraksi Data Spasial (AI Web Scraping)</w:t>
       </w:r>
     </w:p>
     <w:p>
       <w:pPr>
-        <w:spacing w:line="300" w:lineRule="auto"/>
+        <w:spacing w:line="288" w:lineRule="auto"/>
       </w:pPr>
       <w:r>
-        <w:t>Pemeriksaan wajib meliputi pencegahan Lat/Lng Inversion (tertukar lintang dan bujur), verifikasi toponimi fisik cagar budaya melalui citra satelit/OpenStreetMap, serta penentuan Confidence Level (Tinggi vs Interpretatif).</w:t>
+        <w:t>Data cagar budaya dan potensi wilayah umumnya tersimpan dalam bentuk teks berita atau tabel Wikipedia. Peserta menggunakan prompt rekayasa ekstraksi data untuk mengubah tabel tidak terstruktur menjadi JSON array dengan atribut: id, nama_objek, kategori, tahun, latitude, longitude, deskripsi, dan referensi sumber.</w:t>
       </w:r>
     </w:p>
     <w:p>
@@ -407,17 +259,41 @@
           <w:rFonts w:ascii="Arial" w:hAnsi="Arial"/>
           <w:b/>
           <w:color w:val="0F4C3A"/>
-          <w:sz w:val="30"/>
+          <w:sz w:val="28"/>
         </w:rPr>
-        <w:t>5. Fase 3: Panduan Melampirkan Dataset Mandiri Peserta (Ujian Praktikum)</w:t>
+        <w:t>Bagian IV: Protokol Validasi Geospasial (Anti-Hallucination)</w:t>
       </w:r>
     </w:p>
     <w:p>
       <w:pPr>
-        <w:spacing w:line="300" w:lineRule="auto"/>
+        <w:spacing w:line="288" w:lineRule="auto"/>
       </w:pPr>
       <w:r>
-        <w:t>Peserta menyusun spreadsheet CSV mandiri dengan kolom: id, nama_objek, kategori, latitude, longitude, tahun_awal, tahun_akhir, foto_url, sumber_data. File disimpan di data/dataset_mandiri.csv dan dikonversi otomatis oleh Antigravity ke layer Leaflet.</w:t>
+        <w:t>Pemeriksaan kualitas wajib mencakup:</w:t>
+      </w:r>
+    </w:p>
+    <w:p>
+      <w:pPr>
+        <w:spacing w:line="288" w:lineRule="auto"/>
+      </w:pPr>
+      <w:r>
+        <w:t>1. Uji Inversi Koordinat (Lat/Lng Flip): Memastikan nilai Latitude bernilai negatif (0 s/d -11) dan Longitude berkisar 95 s/d 141 BT di wilayah Indonesia.</w:t>
+      </w:r>
+    </w:p>
+    <w:p>
+      <w:pPr>
+        <w:spacing w:line="288" w:lineRule="auto"/>
+      </w:pPr>
+      <w:r>
+        <w:t>2. Verifikasi Toponimi Fisik vs Administrasi: Memastikan titik tepat berada di atas tapak cagar budaya, bukan sekadar kantor kecamatan modern.</w:t>
+      </w:r>
+    </w:p>
+    <w:p>
+      <w:pPr>
+        <w:spacing w:line="288" w:lineRule="auto"/>
+      </w:pPr>
+      <w:r>
+        <w:t>3. Penetapan Confidence Level: Mengklasifikasikan data menjadi Tinggi (arkeologis terdaftar), Sedang (reruntuhan bersejarah), dan Interpretatif (teks naskah kuno).</w:t>
       </w:r>
     </w:p>
     <w:p>
@@ -429,17 +305,17 @@
           <w:rFonts w:ascii="Arial" w:hAnsi="Arial"/>
           <w:b/>
           <w:color w:val="0F4C3A"/>
-          <w:sz w:val="30"/>
+          <w:sz w:val="28"/>
         </w:rPr>
-        <w:t>6. Fase 4 &amp; 5: Prototyping UI &amp; Agentic Coding Antigravity</w:t>
+        <w:t>Bagian V: Panduan Dataset Mandiri Peserta (Ujian Praktikum)</w:t>
       </w:r>
     </w:p>
     <w:p>
       <w:pPr>
-        <w:spacing w:line="300" w:lineRule="auto"/>
+        <w:spacing w:line="288" w:lineRule="auto"/>
       </w:pPr>
       <w:r>
-        <w:t>Eksplorasi palet warna dan komponen responsif dilakukan di Google AI Studio. Hasilnya diintegrasikan ke Google Antigravity yang secara otonom merakit kode JavaScript, penanda custom, popup lazy-loaded image, dan bottom sheet.</w:t>
+        <w:t>Peserta menyusun berkas data/dataset_mandiri.csv dengan kolom baku: id, nama_objek, kategori, latitude, longitude, tahun_awal, tahun_akhir, foto_url, sumber_data. Peserta menginstruksikan Antigravity untuk mengonversi dan memetakan layernya secara instan.</w:t>
       </w:r>
     </w:p>
     <w:p>
@@ -451,17 +327,17 @@
           <w:rFonts w:ascii="Arial" w:hAnsi="Arial"/>
           <w:b/>
           <w:color w:val="0F4C3A"/>
-          <w:sz w:val="30"/>
+          <w:sz w:val="28"/>
         </w:rPr>
-        <w:t>7. Fase 6: Otomasi Publikasi ke GitHub Pages</w:t>
+        <w:t>Bagian VI: Perancangan UI &amp; Pemrograman Otonom (Agentic Coding)</w:t>
       </w:r>
     </w:p>
     <w:p>
       <w:pPr>
-        <w:spacing w:line="300" w:lineRule="auto"/>
+        <w:spacing w:line="288" w:lineRule="auto"/>
       </w:pPr>
       <w:r>
-        <w:t>Peserta menginstruksikan Antigravity untuk menjalankan perintah git push secara otonom. GitHub Pages diaktifkan pada branch main untuk menerbitkan WebGIS secara live dan gratis.</w:t>
+        <w:t>Arsitektur kode dipecah secara modular: map.js (manajemen Leaflet), timeline.js (slider temporal), detail.js (drawer informasi &amp; foto lazy-loading), dan filters.js (filter kategori). Antarmuka menerapkan prinsip Mobile-First dengan floating slider dan interactive bottom sheet.</w:t>
       </w:r>
     </w:p>
     <w:p>
@@ -473,17 +349,61 @@
           <w:rFonts w:ascii="Arial" w:hAnsi="Arial"/>
           <w:b/>
           <w:color w:val="0F4C3A"/>
-          <w:sz w:val="30"/>
+          <w:sz w:val="28"/>
         </w:rPr>
-        <w:t>8. Integrasi Ekosistem Google (Google One AI Premium / Gemini Pro)</w:t>
+        <w:t>Bagian VII: Publikasi Terbuka di GitHub Pages</w:t>
       </w:r>
     </w:p>
     <w:p>
       <w:pPr>
-        <w:spacing w:line="300" w:lineRule="auto"/>
+        <w:spacing w:line="288" w:lineRule="auto"/>
       </w:pPr>
       <w:r>
-        <w:t>Bagi pengguna langganan Google Pro: dokumen ini dapat disalin ke Google Docs untuk diformat dengan Gemini ('Help me write'), ditambahkan ilustrasi otomatis dengan Imagen 3, dan dianalisis menggunakan Google NotebookLM untuk menghasilkan ringkasan panduan studi dan audio FAQ otomatis.</w:t>
+        <w:t>Peserta menginstruksikan Antigravity untuk menjalankan perintah git push secara otonom. GitHub Pages diaktifkan pada branch main untuk menerbitkan WebGIS secara live dan gratis tanpa perlu konfigurasi server rumit.</w:t>
+      </w:r>
+    </w:p>
+    <w:p>
+      <w:pPr>
+        <w:pStyle w:val="Heading1"/>
+      </w:pPr>
+      <w:r>
+        <w:rPr>
+          <w:rFonts w:ascii="Arial" w:hAnsi="Arial"/>
+          <w:b/>
+          <w:color w:val="0F4C3A"/>
+          <w:sz w:val="28"/>
+        </w:rPr>
+        <w:t>Bagian VIII: Lembar Evaluasi &amp; Rubrik Penilaian</w:t>
+      </w:r>
+    </w:p>
+    <w:p>
+      <w:pPr>
+        <w:spacing w:line="288" w:lineRule="auto"/>
+      </w:pPr>
+      <w:r>
+        <w:t>Penilaian ujian praktikum didasarkan pada 4 kriteria: 1) Integritas Data &amp; Validasi Spasial (30%), 2) Fungsionalitas Peta &amp; Interaktivitas (25%), 3) Kualitas UI/UX &amp; Responsif Mobile (25%), dan 4) Keberhasilan Publikasi GitHub Pages (20%).</w:t>
+      </w:r>
+    </w:p>
+    <w:p>
+      <w:pPr>
+        <w:pStyle w:val="Heading1"/>
+      </w:pPr>
+      <w:r>
+        <w:rPr>
+          <w:rFonts w:ascii="Arial" w:hAnsi="Arial"/>
+          <w:b/>
+          <w:color w:val="0F4C3A"/>
+          <w:sz w:val="28"/>
+        </w:rPr>
+        <w:t>Bagian IX: Glosarium &amp; Referensi</w:t>
+      </w:r>
+    </w:p>
+    <w:p>
+      <w:pPr>
+        <w:spacing w:line="288" w:lineRule="auto"/>
+      </w:pPr>
+      <w:r>
+        <w:t>Memuat definisi istilah: CRS, WGS84, GeoJSON, Lat/Lng Inversion, Native Lazy Loading, dan Agentic AI, serta referensi akademik otoritatif (Cribb 2000, Reid 1993, De Graaf 1985, Kemendikbudristek 2020).</w:t>
       </w:r>
     </w:p>
     <w:sectPr>

</xml_diff>